<commit_message>
update with newest frame
</commit_message>
<xml_diff>
--- a/intelligent life assistant.docx
+++ b/intelligent life assistant.docx
@@ -994,7 +994,6 @@
       <w:pPr>
         <w:pStyle w:val="ListParagraph"/>
         <w:rPr>
-          <w:rFonts w:hint="eastAsia"/>
           <w:lang w:val="en-US"/>
         </w:rPr>
       </w:pPr>
@@ -1037,6 +1036,136 @@
         </w:rPr>
         <w:t>调用的方案可以显著加速项目验证，快速验证商业模式的可行性，规避初期稳定性陷阱。</w:t>
       </w:r>
+    </w:p>
+    <w:p>
+      <w:pPr>
+        <w:pStyle w:val="ListParagraph"/>
+        <w:rPr>
+          <w:lang w:val="en-US"/>
+        </w:rPr>
+      </w:pPr>
+    </w:p>
+    <w:p>
+      <w:pPr>
+        <w:pStyle w:val="ListParagraph"/>
+        <w:rPr>
+          <w:lang w:val="en-US"/>
+        </w:rPr>
+      </w:pPr>
+    </w:p>
+    <w:p>
+      <w:pPr>
+        <w:pStyle w:val="ListParagraph"/>
+        <w:rPr>
+          <w:lang w:val="en-US"/>
+        </w:rPr>
+      </w:pPr>
+      <w:r>
+        <w:rPr>
+          <w:rFonts w:hint="eastAsia"/>
+          <w:lang w:val="en-US"/>
+        </w:rPr>
+        <w:t>实验进度</w:t>
+      </w:r>
+    </w:p>
+    <w:p>
+      <w:pPr>
+        <w:pStyle w:val="ListParagraph"/>
+        <w:rPr>
+          <w:lang w:val="en-US"/>
+        </w:rPr>
+      </w:pPr>
+      <w:r>
+        <w:rPr>
+          <w:rFonts w:hint="eastAsia"/>
+          <w:lang w:val="en-US"/>
+        </w:rPr>
+        <w:t>基本框架搭建完成</w:t>
+      </w:r>
+    </w:p>
+    <w:p>
+      <w:pPr>
+        <w:pStyle w:val="ListParagraph"/>
+        <w:rPr>
+          <w:lang w:val="en-US"/>
+        </w:rPr>
+      </w:pPr>
+      <w:r>
+        <w:rPr>
+          <w:rFonts w:hint="eastAsia"/>
+          <w:lang w:val="en-US"/>
+        </w:rPr>
+        <w:t>设置</w:t>
+      </w:r>
+      <w:r>
+        <w:rPr>
+          <w:rFonts w:hint="eastAsia"/>
+          <w:lang w:val="en-US"/>
+        </w:rPr>
+        <w:t xml:space="preserve">GLM 5 </w:t>
+      </w:r>
+      <w:r>
+        <w:rPr>
+          <w:rFonts w:hint="eastAsia"/>
+          <w:lang w:val="en-US"/>
+        </w:rPr>
+        <w:t>做为默认模型</w:t>
+      </w:r>
+    </w:p>
+    <w:p>
+      <w:pPr>
+        <w:pStyle w:val="ListParagraph"/>
+        <w:rPr>
+          <w:rFonts w:hint="eastAsia"/>
+          <w:lang w:val="en-US"/>
+        </w:rPr>
+      </w:pPr>
+      <w:r>
+        <w:rPr>
+          <w:rFonts w:hint="eastAsia"/>
+          <w:lang w:val="en-US"/>
+        </w:rPr>
+        <w:t>（由于网络原因最新实验成果无法上传至</w:t>
+      </w:r>
+      <w:r>
+        <w:rPr>
+          <w:rFonts w:hint="eastAsia"/>
+          <w:lang w:val="en-US"/>
+        </w:rPr>
+        <w:t>git</w:t>
+      </w:r>
+      <w:r>
+        <w:rPr>
+          <w:rFonts w:hint="eastAsia"/>
+          <w:lang w:val="en-US"/>
+        </w:rPr>
+        <w:t>）</w:t>
+      </w:r>
+    </w:p>
+    <w:p>
+      <w:pPr>
+        <w:pStyle w:val="ListParagraph"/>
+        <w:rPr>
+          <w:lang w:val="en-US"/>
+        </w:rPr>
+      </w:pPr>
+    </w:p>
+    <w:p>
+      <w:pPr>
+        <w:pStyle w:val="ListParagraph"/>
+        <w:rPr>
+          <w:lang w:val="en-US"/>
+        </w:rPr>
+      </w:pPr>
+    </w:p>
+    <w:p>
+      <w:pPr>
+        <w:pStyle w:val="ListParagraph"/>
+        <w:rPr>
+          <w:rFonts w:hint="eastAsia"/>
+          <w:lang w:val="en-US"/>
+        </w:rPr>
+      </w:pPr>
     </w:p>
     <w:sectPr>
       <w:pgSz w:w="11906" w:h="16838"/>

</xml_diff>